<commit_message>
Update content docs with new growth strategy & mantras
- Content Bible v1.1: Added Section 11 (Growth Strategy & Vision)
  with multiple coach avatars, equity incentive program, referral
  rewards system, and founder energy philosophy. Added 3 new mantras.
  Updated TOC.
- Executive Summary: Added Phase 2.5 (Equity & Community) to GTM
  strategy with equity stakes, referral contest, conditional free
  month rewards, and multi-avatar coach vision. Updated financial
  model note to reference new programs.
- Origin Story: Added Founder Energy and Growth Strategy sections
  with 3 new mantras. Updated date to Feb 11, 2026.

Co-Authored-By: Claude Opus 4.6 <noreply@anthropic.com>
</commit_message>
<xml_diff>
--- a/white-mike-content/White-Mike-Content-Bible.docx
+++ b/white-mike-content/White-Mike-Content-Bible.docx
@@ -400,6 +400,24 @@
       </w:r>
     </w:p>
     <w:p>
+      <w:pPr>
+        <w:spacing w:after="160"/>
+      </w:pPr>
+      <w:r>
+        <w:rPr>
+          <w:rFonts w:ascii="Arial" w:cs="Arial" w:eastAsia="Arial" w:hAnsi="Arial"/>
+          <w:b/>
+          <w:bCs/>
+          <w:i w:val="false"/>
+          <w:iCs w:val="false"/>
+          <w:color w:val="333333"/>
+          <w:sz w:val="22"/>
+          <w:szCs w:val="22"/>
+        </w:rPr>
+        <w:t xml:space="preserve">11. Growth Strategy &amp; Vision</w:t>
+      </w:r>
+    </w:p>
+    <w:p>
       <w:r>
         <w:br w:type="page"/>
       </w:r>
@@ -2627,6 +2645,66 @@
       </w:r>
     </w:p>
     <w:p>
+      <w:pPr>
+        <w:pBdr>
+          <w:left w:val="single" w:color="D4A843" w:sz="6"/>
+        </w:pBdr>
+        <w:spacing w:before="120" w:after="120"/>
+        <w:ind w:left="720" w:right="720"/>
+      </w:pPr>
+      <w:r>
+        <w:rPr>
+          <w:rFonts w:ascii="Georgia" w:cs="Georgia" w:eastAsia="Georgia" w:hAnsi="Georgia"/>
+          <w:i/>
+          <w:iCs/>
+          <w:color w:val="D4A843"/>
+          <w:sz w:val="24"/>
+          <w:szCs w:val="24"/>
+        </w:rPr>
+        <w:t xml:space="preserve">“The only way I burn out is if my intentions are elsewhere. Otherwise, I can do this all fucking day.”</w:t>
+      </w:r>
+    </w:p>
+    <w:p>
+      <w:pPr>
+        <w:pBdr>
+          <w:left w:val="single" w:color="D4A843" w:sz="6"/>
+        </w:pBdr>
+        <w:spacing w:before="120" w:after="120"/>
+        <w:ind w:left="720" w:right="720"/>
+      </w:pPr>
+      <w:r>
+        <w:rPr>
+          <w:rFonts w:ascii="Georgia" w:cs="Georgia" w:eastAsia="Georgia" w:hAnsi="Georgia"/>
+          <w:i/>
+          <w:iCs/>
+          <w:color w:val="D4A843"/>
+          <w:sz w:val="24"/>
+          <w:szCs w:val="24"/>
+        </w:rPr>
+        <w:t xml:space="preserve">“Elon and others take pills. I don’t need that. Why can’t I hang in the ring with them?”</w:t>
+      </w:r>
+    </w:p>
+    <w:p>
+      <w:pPr>
+        <w:pBdr>
+          <w:left w:val="single" w:color="D4A843" w:sz="6"/>
+        </w:pBdr>
+        <w:spacing w:before="120" w:after="120"/>
+        <w:ind w:left="720" w:right="720"/>
+      </w:pPr>
+      <w:r>
+        <w:rPr>
+          <w:rFonts w:ascii="Georgia" w:cs="Georgia" w:eastAsia="Georgia" w:hAnsi="Georgia"/>
+          <w:i/>
+          <w:iCs/>
+          <w:color w:val="D4A843"/>
+          <w:sz w:val="24"/>
+          <w:szCs w:val="24"/>
+        </w:rPr>
+        <w:t xml:space="preserve">“I can learn anything.”</w:t>
+      </w:r>
+    </w:p>
+    <w:p>
       <w:r>
         <w:br w:type="page"/>
       </w:r>
@@ -4750,6 +4828,334 @@
       </w:tr>
     </w:tbl>
     <w:p>
+      <w:r>
+        <w:br w:type="page"/>
+      </w:r>
+    </w:p>
+    <w:p>
+      <w:pPr>
+        <w:pStyle w:val="Heading1"/>
+        <w:spacing w:before="360" w:after="200"/>
+      </w:pPr>
+      <w:r>
+        <w:rPr>
+          <w:rFonts w:ascii="Arial" w:cs="Arial" w:eastAsia="Arial" w:hAnsi="Arial"/>
+          <w:b/>
+          <w:bCs/>
+          <w:color w:val="1A1A2E"/>
+          <w:sz w:val="36"/>
+          <w:szCs w:val="36"/>
+        </w:rPr>
+        <w:t xml:space="preserve">11. Growth Strategy &amp; Vision</w:t>
+      </w:r>
+    </w:p>
+    <w:tbl>
+      <w:tblPr>
+        <w:tblW w:type="dxa" w:w="9360"/>
+        <w:tblBorders>
+          <w:top w:val="single" w:color="auto" w:sz="4"/>
+          <w:left w:val="single" w:color="auto" w:sz="4"/>
+          <w:bottom w:val="single" w:color="auto" w:sz="4"/>
+          <w:right w:val="single" w:color="auto" w:sz="4"/>
+          <w:insideH w:val="single" w:color="auto" w:sz="4"/>
+          <w:insideV w:val="single" w:color="auto" w:sz="4"/>
+        </w:tblBorders>
+      </w:tblPr>
+      <w:tblGrid>
+        <w:gridCol w:w="9360"/>
+      </w:tblGrid>
+      <w:tr>
+        <w:tc>
+          <w:tcPr>
+            <w:tcW w:type="dxa" w:w="9360"/>
+            <w:tcBorders>
+              <w:top w:val="single" w:color="DDDDDD" w:sz="1"/>
+              <w:left w:val="none"/>
+              <w:bottom w:val="none"/>
+              <w:right w:val="none"/>
+            </w:tcBorders>
+          </w:tcPr>
+          <w:p>
+            <w:pPr>
+              <w:spacing w:before="0" w:after="0"/>
+            </w:pPr>
+            <w:r>
+              <w:rPr>
+                <w:sz w:val="4"/>
+                <w:szCs w:val="4"/>
+              </w:rPr>
+              <w:t xml:space="preserve"/>
+            </w:r>
+          </w:p>
+        </w:tc>
+      </w:tr>
+    </w:tbl>
+    <w:p>
+      <w:pPr>
+        <w:spacing w:before="200"/>
+      </w:pPr>
+    </w:p>
+    <w:p>
+      <w:pPr>
+        <w:spacing w:after="160"/>
+      </w:pPr>
+      <w:r>
+        <w:rPr>
+          <w:rFonts w:ascii="Arial" w:cs="Arial" w:eastAsia="Arial" w:hAnsi="Arial"/>
+          <w:b w:val="false"/>
+          <w:bCs w:val="false"/>
+          <w:color w:val="333333"/>
+          <w:sz w:val="22"/>
+          <w:szCs w:val="22"/>
+        </w:rPr>
+        <w:t xml:space="preserve">These ideas represent the next phase of Top Performer — scaling beyond a solo coaching app into a platform that rewards believers and attracts diverse communities.</w:t>
+      </w:r>
+    </w:p>
+    <w:p>
+      <w:pPr>
+        <w:spacing w:before="200" w:after="120"/>
+      </w:pPr>
+      <w:r>
+        <w:rPr>
+          <w:rFonts w:ascii="Arial" w:cs="Arial" w:eastAsia="Arial" w:hAnsi="Arial"/>
+          <w:b/>
+          <w:bCs/>
+          <w:color w:val="1A1A2E"/>
+          <w:sz w:val="26"/>
+          <w:szCs w:val="26"/>
+        </w:rPr>
+        <w:t xml:space="preserve">Multiple Coach Avatars</w:t>
+      </w:r>
+    </w:p>
+    <w:p>
+      <w:pPr>
+        <w:spacing w:after="160"/>
+      </w:pPr>
+      <w:r>
+        <w:rPr>
+          <w:rFonts w:ascii="Arial" w:cs="Arial" w:eastAsia="Arial" w:hAnsi="Arial"/>
+          <w:color w:val="333333"/>
+          <w:sz w:val="22"/>
+          <w:szCs w:val="22"/>
+        </w:rPr>
+        <w:t xml:space="preserve">Mike is the first coach, but the platform is designed for more. Real people with real stories become coaching avatars to attract different communities. A female voice for women who need to hear it from someone who gets their world. A veteran for people coming out of the military. A former athlete for the sports crowd. Each avatar brings their own origin story, their own voice, their own experience — but all built on the same coaching framework.</w:t>
+      </w:r>
+    </w:p>
+    <w:p>
+      <w:pPr>
+        <w:pBdr>
+          <w:left w:val="single" w:color="D4A843" w:sz="6"/>
+        </w:pBdr>
+        <w:spacing w:before="120" w:after="120"/>
+        <w:ind w:left="720" w:right="720"/>
+      </w:pPr>
+      <w:r>
+        <w:rPr>
+          <w:rFonts w:ascii="Georgia" w:cs="Georgia" w:eastAsia="Georgia" w:hAnsi="Georgia"/>
+          <w:i/>
+          <w:iCs/>
+          <w:color w:val="D4A843"/>
+          <w:sz w:val="24"/>
+          <w:szCs w:val="24"/>
+        </w:rPr>
+        <w:t xml:space="preserve">“We can make more avatars to attract different people. You gone be next dawg.”</w:t>
+      </w:r>
+    </w:p>
+    <w:p>
+      <w:pPr>
+        <w:spacing w:after="160"/>
+      </w:pPr>
+      <w:r>
+        <w:rPr>
+          <w:rFonts w:ascii="Arial" w:cs="Arial" w:eastAsia="Arial" w:hAnsi="Arial"/>
+          <w:color w:val="333333"/>
+          <w:sz w:val="22"/>
+          <w:szCs w:val="22"/>
+        </w:rPr>
+        <w:t xml:space="preserve">The key is authenticity. These aren’t actors reading scripts. These are real people who lived it, sharing their stories so others can see themselves in the journey. That’s the “Real People Helping Real People” philosophy at scale.</w:t>
+      </w:r>
+    </w:p>
+    <w:p>
+      <w:pPr>
+        <w:spacing w:before="200" w:after="120"/>
+      </w:pPr>
+      <w:r>
+        <w:rPr>
+          <w:rFonts w:ascii="Arial" w:cs="Arial" w:eastAsia="Arial" w:hAnsi="Arial"/>
+          <w:b/>
+          <w:bCs/>
+          <w:color w:val="1A1A2E"/>
+          <w:sz w:val="26"/>
+          <w:szCs w:val="26"/>
+        </w:rPr>
+        <w:t xml:space="preserve">Equity Incentive Program</w:t>
+      </w:r>
+    </w:p>
+    <w:p>
+      <w:pPr>
+        <w:spacing w:after="160"/>
+      </w:pPr>
+      <w:r>
+        <w:rPr>
+          <w:rFonts w:ascii="Arial" w:cs="Arial" w:eastAsia="Arial" w:hAnsi="Arial"/>
+          <w:color w:val="333333"/>
+          <w:sz w:val="22"/>
+          <w:szCs w:val="22"/>
+        </w:rPr>
+        <w:t xml:space="preserve">Pay people back by giving them ownership. Early believers who put in work to grow the app can earn equity — small stakes (1% or so) for real impact. If you believe in the app now, apply and earn equity by bringing real users in. This isn’t a handout. It’s sweat equity for people who see the vision and want to be part of it.</w:t>
+      </w:r>
+    </w:p>
+    <w:p>
+      <w:pPr>
+        <w:pBdr>
+          <w:left w:val="single" w:color="D4A843" w:sz="6"/>
+        </w:pBdr>
+        <w:spacing w:before="120" w:after="120"/>
+        <w:ind w:left="720" w:right="720"/>
+      </w:pPr>
+      <w:r>
+        <w:rPr>
+          <w:rFonts w:ascii="Georgia" w:cs="Georgia" w:eastAsia="Georgia" w:hAnsi="Georgia"/>
+          <w:i/>
+          <w:iCs/>
+          <w:color w:val="D4A843"/>
+          <w:sz w:val="24"/>
+          <w:szCs w:val="24"/>
+        </w:rPr>
+        <w:t xml:space="preserve">“If you believe in the app now, apply and earn equity by selling people to sign up.”</w:t>
+      </w:r>
+    </w:p>
+    <w:p>
+      <w:pPr>
+        <w:spacing w:before="200" w:after="120"/>
+      </w:pPr>
+      <w:r>
+        <w:rPr>
+          <w:rFonts w:ascii="Arial" w:cs="Arial" w:eastAsia="Arial" w:hAnsi="Arial"/>
+          <w:b/>
+          <w:bCs/>
+          <w:color w:val="1A1A2E"/>
+          <w:sz w:val="26"/>
+          <w:szCs w:val="26"/>
+        </w:rPr>
+        <w:t xml:space="preserve">Referral Rewards System</w:t>
+      </w:r>
+    </w:p>
+    <w:p>
+      <w:pPr>
+        <w:spacing w:after="160"/>
+      </w:pPr>
+      <w:r>
+        <w:rPr>
+          <w:rFonts w:ascii="Arial" w:cs="Arial" w:eastAsia="Arial" w:hAnsi="Arial"/>
+          <w:color w:val="333333"/>
+          <w:sz w:val="22"/>
+          <w:szCs w:val="22"/>
+        </w:rPr>
+        <w:t xml:space="preserve">Two layers of referral incentives designed to create aligned growth:</w:t>
+      </w:r>
+    </w:p>
+    <w:p>
+      <w:pPr>
+        <w:spacing w:after="120"/>
+      </w:pPr>
+      <w:r>
+        <w:rPr>
+          <w:rFonts w:ascii="Arial" w:cs="Arial" w:eastAsia="Arial" w:hAnsi="Arial"/>
+          <w:b/>
+          <w:bCs/>
+          <w:color w:val="333333"/>
+          <w:sz w:val="22"/>
+          <w:szCs w:val="22"/>
+        </w:rPr>
+        <w:t xml:space="preserve">Referral Contest:</w:t>
+      </w:r>
+      <w:r>
+        <w:rPr>
+          <w:rFonts w:ascii="Arial" w:cs="Arial" w:eastAsia="Arial" w:hAnsi="Arial"/>
+          <w:color w:val="333333"/>
+          <w:sz w:val="22"/>
+          <w:szCs w:val="22"/>
+        </w:rPr>
+        <w:t xml:space="preserve"> Time-bound competition with a deadline. Who can refer the most real users? Creates urgency, creates community, creates winners.</w:t>
+      </w:r>
+    </w:p>
+    <w:p>
+      <w:pPr>
+        <w:spacing w:after="120"/>
+      </w:pPr>
+      <w:r>
+        <w:rPr>
+          <w:rFonts w:ascii="Arial" w:cs="Arial" w:eastAsia="Arial" w:hAnsi="Arial"/>
+          <w:b/>
+          <w:bCs/>
+          <w:color w:val="333333"/>
+          <w:sz w:val="22"/>
+          <w:szCs w:val="22"/>
+        </w:rPr>
+        <w:t xml:space="preserve">Free Month Per Referral:</w:t>
+      </w:r>
+      <w:r>
+        <w:rPr>
+          <w:rFonts w:ascii="Arial" w:cs="Arial" w:eastAsia="Arial" w:hAnsi="Arial"/>
+          <w:color w:val="333333"/>
+          <w:sz w:val="22"/>
+          <w:szCs w:val="22"/>
+        </w:rPr>
+        <w:t xml:space="preserve"> Refer someone and your month is free the month they sign up. But here’s the catch — if the person you referred drops off, your free month goes away too. You only win when your people stick around. Aligned incentives. You’re not just referring bodies, you’re bringing people who actually need this.</w:t>
+      </w:r>
+    </w:p>
+    <w:p>
+      <w:pPr>
+        <w:spacing w:before="200" w:after="120"/>
+      </w:pPr>
+      <w:r>
+        <w:rPr>
+          <w:rFonts w:ascii="Arial" w:cs="Arial" w:eastAsia="Arial" w:hAnsi="Arial"/>
+          <w:b/>
+          <w:bCs/>
+          <w:color w:val="1A1A2E"/>
+          <w:sz w:val="26"/>
+          <w:szCs w:val="26"/>
+        </w:rPr>
+        <w:t xml:space="preserve">Founder Energy</w:t>
+      </w:r>
+    </w:p>
+    <w:p>
+      <w:pPr>
+        <w:spacing w:after="160"/>
+      </w:pPr>
+      <w:r>
+        <w:rPr>
+          <w:rFonts w:ascii="Arial" w:cs="Arial" w:eastAsia="Arial" w:hAnsi="Arial"/>
+          <w:color w:val="333333"/>
+          <w:sz w:val="22"/>
+          <w:szCs w:val="22"/>
+        </w:rPr>
+        <w:t xml:space="preserve">The only way Mike burns out is if his intentions shift. As long as the mission stays pure — helping people grow — the energy is unlimited. No pills, no supplements, no artificial stimulants. Just purpose-driven fuel. Elon and the rest of them take pills to keep going. Mike doesn’t need that. The love of the game is the drug. The ability to learn anything, challenge anyone, and show up every single day — that’s not motivation, that’s identity.</w:t>
+      </w:r>
+    </w:p>
+    <w:p>
+      <w:pPr>
+        <w:pBdr>
+          <w:left w:val="single" w:color="D4A843" w:sz="6"/>
+        </w:pBdr>
+        <w:spacing w:before="120" w:after="120"/>
+        <w:ind w:left="720" w:right="720"/>
+      </w:pPr>
+      <w:r>
+        <w:rPr>
+          <w:rFonts w:ascii="Georgia" w:cs="Georgia" w:eastAsia="Georgia" w:hAnsi="Georgia"/>
+          <w:i/>
+          <w:iCs/>
+          <w:color w:val="D4A843"/>
+          <w:sz w:val="24"/>
+          <w:szCs w:val="24"/>
+        </w:rPr>
+        <w:t xml:space="preserve">“I can learn anything. The only way I burn out is if my intentions are elsewhere. Otherwise, I can do this all fucking day.”</w:t>
+      </w:r>
+    </w:p>
+    <w:p>
       <w:pPr>
         <w:spacing w:before="200"/>
       </w:pPr>
@@ -4768,7 +5174,7 @@
           <w:sz w:val="20"/>
           <w:szCs w:val="20"/>
         </w:rPr>
-        <w:t xml:space="preserve">END OF CONTENT BIBLE — VERSION 1.0</w:t>
+        <w:t xml:space="preserve">END OF CONTENT BIBLE — VERSION 1.1</w:t>
       </w:r>
     </w:p>
     <w:p>

</xml_diff>